<commit_message>
docs: reconcile P0 plan with repository facts
</commit_message>
<xml_diff>
--- a/docs/TECHNICAL-ADVISORY-REPORT.docx
+++ b/docs/TECHNICAL-ADVISORY-REPORT.docx
@@ -75,7 +75,7 @@
           <w:sz w:val="19"/>
           <w:szCs w:val="19"/>
         </w:rPr>
-        <w:t>讨论稿 v4.0   |   2026-10-26</w:t>
+        <w:t>事实订正版 v4.1   |   2026-10-26   |   F授权文档审定</w:t>
       </w:r>
     </w:p>
     <w:p>
@@ -94,7 +94,7 @@
           <w:sz w:val="17"/>
           <w:szCs w:val="17"/>
         </w:rPr>
-        <w:t>基于主项目与桥板固件源码核查及用户确认需求</w:t>
+        <w:t>基于Pi主线20013b2与ESP服务16aebdd源码、任务清单及历史记录复核</w:t>
       </w:r>
     </w:p>
     <w:p>
@@ -158,7 +158,7 @@
           <w:sz w:val="18"/>
           <w:szCs w:val="18"/>
         </w:rPr>
-        <w:t>本报告区分已确认需求、源码现状、技术建议和待决策事项。图解为逻辑架构示意，不代表真实接线、已实现功能或实机测量。目录使用 Word 原生标题字段；首次打开如页码未更新，请在 Word 中选择“更新整个目录”。</w:t>
+        <w:t>本报告区分用户指定目标、源码现状、历史记录、本轮主机测试和待实测事项。v4.1订正SDK差异、跟踪产物风险、P0分期、锁屏任务及Qt版本等事实。图解为目标逻辑架构，非真实接线/已实现功能/实机测量。目录使用Word标题字段，打开后更新整个目录。执行接口与F审定记录见docs/devdocs/04-dev-tasks-f-day1.md及04-dev-tasks-f-review.md。</w:t>
       </w:r>
     </w:p>
     <w:sdt>
@@ -2114,7 +2114,7 @@
         <w:jc w:val="left"/>
       </w:pPr>
       <w:r>
-        <w:t>建议采用先安全基础、后场景模块的路线：先建设本机用户身份/数据边界、受限模块进程和新的强制加密协议，再推进桥板双槽、血压计与啸天围栏。这样避免先让健康数据进入现有同进程插件，再为隔离返工。</w:t>
+        <w:t>P0执行口径现已按用户确认扩展为14天最小系统：真实RC522→Pi/PIN、每用户SQLCipher、基础低权限worker、认证加密业务数据、盆栽全部已有传感器字段、啸天两路真实输入、两模块分别及同时运行。先守住身份/数据/进程边界，禁止把健康数据接入现有同进程插件后就宣称隔离。完整备份恢复、生产加固、测速/户外等仍是后续；以下旧建议分期已统一到T-01～T-17。</w:t>
       </w:r>
     </w:p>
     <w:p>
@@ -2458,7 +2458,7 @@
           <w:sz w:val="19"/>
           <w:szCs w:val="19"/>
         </w:rPr>
-        <w:t>P0：仓库/SDK 权威源、威胁模型、协议与身份设计。</w:t>
+        <w:t>P0（14天）：范围/接口/身份安全设计、Pi环境/SDK来源检查、逐桥及逐模块认证、PBR AEAD/ACK、PIN会话及任务归属。</w:t>
       </w:r>
     </w:p>
     <w:p>
@@ -2482,7 +2482,7 @@
           <w:sz w:val="19"/>
           <w:szCs w:val="19"/>
         </w:rPr>
-        <w:t>P1：本机用户、PIN、锁屏、数据归属、加密存储与恢复。</w:t>
+        <w:t>P0硬门槛：每用户SQLCipher、基础worker/受控UI/默认拒网、LAN TLS、盆栽全部数据、啸天双路真实输入、双槽同时运行与单槽故障隔离。</w:t>
       </w:r>
     </w:p>
     <w:p>
@@ -2506,7 +2506,7 @@
           <w:sz w:val="19"/>
           <w:szCs w:val="19"/>
         </w:rPr>
-        <w:t>P2：插件进程隔离、受控 UI、网络代理及新协议。</w:t>
+        <w:t>P1：完整加密备份/离线恢复码/删除流程、生产PKI/密钥生命周期、完整systemd与网络加固、受控域名代理。</w:t>
       </w:r>
     </w:p>
     <w:p>
@@ -2530,7 +2530,7 @@
           <w:sz w:val="19"/>
           <w:szCs w:val="19"/>
         </w:rPr>
-        <w:t>P3：双槽桥板、电池遥测和系统电量集成。</w:t>
+        <w:t>P1：双槽长期硬件产品化、啸天方向/测速/户外验证、正式安全NFC卡、单型号血压计和整机电量遥测。</w:t>
       </w:r>
     </w:p>
     <w:p>
@@ -2544,7 +2544,7 @@
         <w:ind w:left="420" w:hanging="220"/>
       </w:pPr>
       <w:r>
-        <w:t>P4：单型号血压计与啸天红外围栏原型、实机验证。</w:t>
+        <w:t>P2：SDK完整发布自动化、终端/模块版本更新方案、进一步适老化及生产维修；P0最小跨仓来源与哈希检查不得等到P2。</w:t>
       </w:r>
     </w:p>
     <w:p>
@@ -2734,7 +2734,7 @@
           </w:tcPr>
           <w:p>
             <w:r>
-              <w:t>远端 main：8349ce8；本报告更新基于该最新主线</w:t>
+              <w:t>本轮origin/main：20013b242e8f28da788a3bd966272f960e56be08；pi_terminal代码与8349ce8一致</w:t>
             </w:r>
           </w:p>
         </w:tc>
@@ -2752,7 +2752,7 @@
           </w:tcPr>
           <w:p>
             <w:r>
-              <w:t>本报告为独立技术文件；README 未改。</w:t>
+              <w:t>已fetch并核对；本轮只改建议报告和任务/审核文档，README与实现未改。</w:t>
             </w:r>
           </w:p>
         </w:tc>
@@ -2930,7 +2930,7 @@
           <w:sz w:val="20"/>
           <w:szCs w:val="20"/>
         </w:rPr>
-        <w:t xml:space="preserve">两个仓库中 </w:t>
+        <w:t>本轮按Git跟踪文件比较：两仓module-devkit共有506个文件，其中503个字节相同；README.md、docs/MAINTENANCE.md、sdk/SOURCE-MANIFEST.json三项不同。Pi独有8个为比赛产物与示例嵌入包，ESP独有2个为啸天需求/计划。Pi的sync_module_devkit.py --check因13项ESP源映射缺失失败；ESP脚本已排除Pi源映射，本轮以“source copies match but manifest needs refresh”失败（464项清单中461项元数据需刷新）。原报告“全相同/ESP缺三项Pi源”的判断不适用当前基线。D/Z须在T-02提交明确的跨仓来源/commit/路径/哈希及校验路线；本轮未运行--write。</w:t>
       </w:r>
       <w:r>
         <w:rPr>
@@ -2943,7 +2943,6 @@
           <w:sz w:val="20"/>
           <w:szCs w:val="20"/>
         </w:rPr>
-        <w:t>module-devkit/</w:t>
       </w:r>
       <w:r>
         <w:rPr>
@@ -2956,7 +2955,6 @@
           <w:sz w:val="20"/>
           <w:szCs w:val="20"/>
         </w:rPr>
-        <w:t xml:space="preserve"> 有 506 个共有文件且字节内容相同；固件仓库运行 </w:t>
       </w:r>
       <w:r>
         <w:rPr>
@@ -2969,7 +2967,6 @@
           <w:sz w:val="20"/>
           <w:szCs w:val="20"/>
         </w:rPr>
-        <w:t>tools/sync_module_devkit.py --check</w:t>
       </w:r>
       <w:r>
         <w:rPr>
@@ -2982,7 +2979,6 @@
           <w:sz w:val="20"/>
           <w:szCs w:val="20"/>
         </w:rPr>
-        <w:t xml:space="preserve"> 时报告缺少 </w:t>
       </w:r>
       <w:r>
         <w:rPr>
@@ -2995,7 +2991,6 @@
           <w:sz w:val="20"/>
           <w:szCs w:val="20"/>
         </w:rPr>
-        <w:t>pi_terminal/src/modules/api/pi_module_api.h</w:t>
       </w:r>
       <w:r>
         <w:rPr>
@@ -3008,7 +3003,6 @@
           <w:sz w:val="20"/>
           <w:szCs w:val="20"/>
         </w:rPr>
-        <w:t>、</w:t>
       </w:r>
       <w:r>
         <w:rPr>
@@ -3021,7 +3015,6 @@
           <w:sz w:val="20"/>
           <w:szCs w:val="20"/>
         </w:rPr>
-        <w:t>pi_terminal/tools/package_tool.py</w:t>
       </w:r>
       <w:r>
         <w:rPr>
@@ -3034,7 +3027,6 @@
           <w:sz w:val="20"/>
           <w:szCs w:val="20"/>
         </w:rPr>
-        <w:t>、</w:t>
       </w:r>
       <w:r>
         <w:rPr>
@@ -3047,7 +3039,6 @@
           <w:sz w:val="20"/>
           <w:szCs w:val="20"/>
         </w:rPr>
-        <w:t>pi_terminal/tools/mock_module.py</w:t>
       </w:r>
       <w:r>
         <w:rPr>
@@ -3060,7 +3051,6 @@
           <w:sz w:val="20"/>
           <w:szCs w:val="20"/>
         </w:rPr>
-        <w:t>。这说明同步脚本仍假定源码同处一个仓库，需先确定 SDK 的权威发布/依赖方式。</w:t>
       </w:r>
     </w:p>
     <w:p>
@@ -3101,7 +3091,7 @@
         <w:spacing w:after="120" w:line="269" w:lineRule="auto"/>
       </w:pPr>
       <w:r>
-        <w:t>本次最新桥板/模块仓库为 gggitj/ESP-Modular-Terminal-Service，main 16aebdd5e2bd17c0addd0b00e3e963cef3252584；Pi 主项目审阅基线 main 8349ce8。此前 gggitj/esp32-smart（b67c8c8）为历史前身。当前 service 仓库的正式 esp/ 与 module-devkit 为桥板/SDK 基线；Pi 终端服务/页面在 Pi 仓库单独维护。</w:t>
+        <w:t>最新桥板/模块仓库为gggitj/ESP-Modular-Terminal-Service，main 16aebdd5e2bd17c0addd0b00e3e963cef3252584；Pi本轮fetch后origin/main为20013b242e8f28da788a3bd966272f960e56be08，pi_terminal代码树与8349ce8一致，差异为文档。此前gggitj/esp32-smart为历史前身。esp/属于独立ESP仓，Pi侧C ABI/服务/页面属于Pi仓，不能把共享目录名等同单仓权威。</w:t>
       </w:r>
     </w:p>
     <w:p>
@@ -3125,7 +3115,7 @@
         <w:spacing w:after="120" w:line="269" w:lineRule="auto"/>
       </w:pPr>
       <w:r>
-        <w:t>安全含义：当前 PBR1 使用 CRC16、方向/类型、序号和长度，可做检错/流重同步，但不认证桥板来源，也不加密 UID。已确认采用逐板 bridge_id 与双向认证 AEAD；正式桥板密钥受 Secure Boot + Flash Encryption 保护；读卡事件要有 event_id、ACK、有界重传/TTL 和 Pi 侧幂等去重。Pi 只在验证 AEAD 后处理 UID；CRC 不当作 MAC。</w:t>
+        <w:t>安全含义：当前PBR1 CRC16/方向/类型/序号/长度仅作检错和重同步，不认证桥板、不加密UID。P0目标是项目签发逐桥测试身份与双向认证AEAD，事件带event_id、ACK、有界重传/TTL及Pi幂等去重，认证后才处理UID。Secure Boot/Flash Encryption为生产保护目标，当前设备启用状态未核实，P0不冒称具备。RC522为桥板级事件，不伪造模块slot/device上下文。</w:t>
       </w:r>
     </w:p>
     <w:p>
@@ -3255,7 +3245,7 @@
           </w:tcPr>
           <w:p>
             <w:r>
-              <w:t>ConnectionManager 按实例管理会话，最多 8 个；有认证会话、序号、签名包、用户信任门槛</w:t>
+              <w:t>按module_instance最多8会话；token/序号、签名包与非用户作用域信任门槛</w:t>
             </w:r>
           </w:p>
         </w:tc>
@@ -3273,7 +3263,7 @@
           </w:tcPr>
           <w:p>
             <w:r>
-              <w:t>多会话容器不等于双槽桥板端到端支持；用户信任目前不是用户作用域</w:t>
+              <w:t>不是设备证书/用户授权；多会话不等于双槽。P0保留detach后有效无线业务，补设备/任务授权、槽位复用及控制恢复绑定校验，不改为拔槽即停任务。</w:t>
             </w:r>
           </w:p>
         </w:tc>
@@ -3668,7 +3658,7 @@
           </w:tcPr>
           <w:p>
             <w:r>
-              <w:t>主应用有 QSettings；音乐登录凭证单独存放；没有发现通用终端用户账户和健康记录库</w:t>
+              <w:t>QSettings/音乐账号；无通用终端用户或SQLCipher库；盆栽已有按实例明文JSON历史</w:t>
             </w:r>
           </w:p>
         </w:tc>
@@ -3686,7 +3676,7 @@
           </w:tcPr>
           <w:p>
             <w:r>
-              <w:t>需要新建服务层，不能将音乐服务账号等同系统用户</w:t>
+              <w:t>T-04/10/11/13须迁可信用户服务并禁用旧JSON写入，不自动删除或给旧记录编造用户归属。</w:t>
             </w:r>
           </w:p>
         </w:tc>
@@ -4053,6 +4043,29 @@
         <w:t>3. 产品边界与安全原则</w:t>
       </w:r>
       <w:bookmarkEnd w:id="3008"/>
+    </w:p>
+    <w:p>
+      <w:pPr>
+        <w:pStyle w:val="Heading2"/>
+      </w:pPr>
+      <w:r>
+        <w:t>2.5 本轮复核、已跟踪产物与发布阻塞</w:t>
+      </w:r>
+    </w:p>
+    <w:p>
+      <w:r>
+        <w:t>本轮发现Pi main已跟踪module-devkit/artifacts/smart-planter-3.0.0/下6个文件（含1160208字节固件）及示例embedded_package.json/.tar.zst两项。产物说明明确称固件含本机私有provision配置；gitignore不取消已跟踪文件。因此“不公开/已忽略”的描述不能当作仓库事实。本轮未提取、打印或判断具体凭据是否仍有效。</w:t>
+      </w:r>
+    </w:p>
+    <w:p>
+      <w:r>
+        <w:t>B-07保持最高优先级相关产物发布阻塞。用户授权本机只读核查，本轮对已跟踪固件做可打印字符串模式扫描：0个PEM私钥块、0个字段名=长值候选、20处凭据相关字符串（可能为格式串）。未打印具体值、联网验证、访问设备或修改文件；不能据此证明无秘密或凭据失效。F/D/L仍须在受控构建环境核查配置来源与有效性；有效凭据先轮换，取消跟踪/删除/改写历史另行明确授权。</w:t>
+      </w:r>
+    </w:p>
+    <w:p>
+      <w:r>
+        <w:t>本轮主机验证：x86_64/Qt6.10.1现有Pi protocol_test与盆栽history/ABI测试通过，SDK validate通过；Linux GCC下RC522子程序通过，但全套ESP runner失败于并发fixture依赖windows.h，GPIO guard未执行。两仓SDK --check均失败，原因见2.1。本轮无Pi/ESP实机预检，不能替目标Qt6.5.3、SQLCipher、worker、TLS或双槽签认。</w:t>
+      </w:r>
     </w:p>
     <w:p>
       <w:pPr>
@@ -4856,7 +4869,7 @@
         <w:jc w:val="left"/>
       </w:pPr>
       <w:r>
-        <w:t>目标硬件基线已确认：Raspberry Pi 3B + Raspberry Pi OS Bookworm；Pi 3B 通常为 1 GB RAM，实际板型/revision 仍需现场核对。性能取舍：先用原生低权限进程、Unix socket、事件驱动和按需启动；不为每个模块启动一套 Qt 引擎。工作进程应尽量使用轻量原生运行时，UI 始终由宿主受控组件渲染。需测量单模块/双模块并行的内存峰值、启动延迟、CPU、SQLCipher KDF 延迟和存储写入；不得为跑得动而绕过跨用户/网络隔离。桌面会话/托盘接口仍待确认。</w:t>
+        <w:t>用户指定目标为Pi 3B、ARM64 Raspberry Pi OS Bookworm、Qt6.5.3、Wayland；本轮未连接Pi核验。SDK盆栽历史VALIDATION记录使用Qt6.4.2与labwc/Wayland，不代表目标Qt6.5.3已验证。Pi 3B通常1GB RAM，板型/revision仍需现场核对。原生低权限worker按需启动，不为每模块建Qt引擎；必须测双模块内存/CPU/启动/SQLCipher KDF与写入延迟，不以放弃隔离换性能。面板/UPower接口仍待核验。</w:t>
       </w:r>
     </w:p>
     <w:p>
@@ -5180,7 +5193,7 @@
           <w:sz w:val="20"/>
           <w:szCs w:val="20"/>
         </w:rPr>
-        <w:t>QML 负责交互，不持有数据库密钥。自动锁屏隐藏敏感内容、锁定数据访问界面；不销毁正在运行的健康/围栏任务，也不改变其任务用户。锁屏告警使用通用文字/提示音，避免播报姓名、读数和精确位置。</w:t>
+        <w:t>自动锁屏隐藏敏感内容并撤销前台读取，不停止已授权健康/围栏任务，也不改变启动用户。前台会话能力与任务能力分开：可信服务仅为运行任务保留必要解锁状态，任务只可追加绑定用户/设备的新记录，不可读取历史、导出或选择其他用户。切换/退出前按5.3收尾，随后关库并撤销旧任务。锁屏告警使用通用提示，不播姓名、读数或精确位置。此处订正F第一稿“锁屏即停任务”的偏差；功能尚待实现。</w:t>
       </w:r>
     </w:p>
     <w:p>
@@ -5376,7 +5389,7 @@
           <w:sz w:val="20"/>
           <w:szCs w:val="20"/>
         </w:rPr>
-        <w:t>首期每用户一个独立 SQLCipher 数据库，不强制全盘加密。建议由一个受信任数据服务管理 DB 连接，模块进程只调用白名单 API，不直接持有 SQLCipher 文件、数据库密钥或任意 SQL 权限。</w:t>
+        <w:t>P0要求每用户独立SQLCipher数据库，由可信数据服务管理连接；worker/QML不持有DB文件、key或任意SQL。当前盆栽module.cpp/History.h已存在按module_instance散列文件名保存的明文JSON温度历史，没有userId；散列文件名不是加密。T-10/11/13须迁到可信API并禁用P0旧JSON读写。无归属旧记录默认保留且不供P0业务读取，不得自动归给首位用户或擅自删除；迁移/删除须用户确认。</w:t>
       </w:r>
     </w:p>
     <w:p>
@@ -5520,7 +5533,7 @@
         <w:jc w:val="left"/>
       </w:pPr>
       <w:r>
-        <w:t>不引入全盘加密、云端 KMS 或复杂多层密钥服务器。恢复凭证丢失时必须诚实提示：管理员不能代解密；只能删除旧密钥/资料并从空档案开始。 用户已确认每人持有独立离线恢复码；遗失后管理员不能代解，只能由用户选择清除旧数据并重建档案。恢复码应与 USB 备份分开保管。</w:t>
+        <w:t>产品长期目标保留独立离线恢复码，与USB备份分开保管；但完整恢复凭证/备份/删除流程列P1，P0不得声称已可恢复。P0随机DB key由PIN派生KEK认证封装，改PIN原子重封装；无恢复能力时须提示遗忘PIN/介质损坏可导致不可恢复。管理员不代解密成员数据，不引入云KMS/万能恢复PIN。</w:t>
       </w:r>
     </w:p>
     <w:p>
@@ -6206,7 +6219,7 @@
           <w:sz w:val="19"/>
           <w:szCs w:val="19"/>
         </w:rPr>
-        <w:t>SDK 提供设备密钥生成/注册、挑战响应、证书/指纹验证和开发测试工具；公开 SDK、模板和通用镜像不含共享生产私钥。</w:t>
+        <w:t>目标SDK应新增设备密钥生成/注册、挑战认证、凭据/指纹验证和假密钥测试工具，当前不能由现有token/签名包推断这些已实现。桥板仅项目签发逐板测试身份，签发私钥由F受控保存，Pi只持验证公钥；模块保留正式签发/逐台DIY两条路线，P0盆栽和啸天各独立DIY测试身份。公开SDK、模板及通用镜像不得含共享生产私钥或有效设备secret；现有跟踪固件风险见2.5。</w:t>
       </w:r>
     </w:p>
     <w:p>
@@ -6230,7 +6243,7 @@
           <w:sz w:val="19"/>
           <w:szCs w:val="19"/>
         </w:rPr>
-        <w:t>正式设备走项目/厂商证书链；DIY 模块逐台生成密钥，首次配对时当前用户核对指纹。</w:t>
+        <w:t>设备全局配对由本地管理员核对指纹显式确认；正式模块走项目/厂商签发，DIY模块逐台唯一密钥。登记设备不自动授予访问成员数据，用户仍须按设备/能力自行授权；管理员无权代成员授予健康历史读取。</w:t>
       </w:r>
     </w:p>
     <w:p>
@@ -6511,7 +6524,7 @@
           <w:sz w:val="20"/>
           <w:szCs w:val="20"/>
         </w:rPr>
-        <w:t xml:space="preserve">当前 </w:t>
+        <w:t>当前ModuleManager通过QLibrary在宿主主进程加载C ABI，模块QML也进入宿主；manifest/信任弹窗不是OS隔离。P0至少迁为每实例独立低权限worker、有界版本IPC、宿主受控UI、文件/DB拒绝及默认拒公网。完整CPU/内存/seccomp/namespace加固及网络代理按P1深化，但P0必须以真实拒绝测试证明基本边界，QProcess本身不算沙箱。</w:t>
       </w:r>
       <w:r>
         <w:rPr>
@@ -6524,7 +6537,6 @@
           <w:sz w:val="20"/>
           <w:szCs w:val="20"/>
         </w:rPr>
-        <w:t>QLibrary</w:t>
       </w:r>
       <w:r>
         <w:rPr>
@@ -6537,7 +6549,6 @@
           <w:sz w:val="20"/>
           <w:szCs w:val="20"/>
         </w:rPr>
-        <w:t xml:space="preserve"> 主进程加载必须逐步淘汰。目标：每个模块实例独立低权限进程，使用有版本 IPC；限定文件目录、CPU/内存/队列、进程能力和网络命名空间；默认不可读用户数据库，也不可直接连接公网。网络只经主机代理。</w:t>
       </w:r>
     </w:p>
     <w:p>
@@ -6620,7 +6631,7 @@
           <w:sz w:val="31"/>
           <w:szCs w:val="31"/>
         </w:rPr>
-        <w:t>9. 新安全通信协议和 HTTPS</w:t>
+        <w:t>9. 新安全通信协议、TLS与HTTPS</w:t>
       </w:r>
       <w:bookmarkEnd w:id="3029"/>
     </w:p>
@@ -7239,7 +7250,7 @@
           <w:sz w:val="26"/>
           <w:szCs w:val="26"/>
         </w:rPr>
-        <w:t>9.3 联网总开关与有限网络</w:t>
+        <w:t>9.3 联网总开关与有限网络（长期产品策略）</w:t>
       </w:r>
       <w:bookmarkEnd w:id="3032"/>
     </w:p>
@@ -7384,7 +7395,7 @@
           <w:sz w:val="19"/>
           <w:szCs w:val="19"/>
         </w:rPr>
-        <w:t>不做蜂窝热点；网络限制场景包括完全离线、弱网、高延迟、低带宽和频繁断开。</w:t>
+        <w:t>不做蜂窝热点；离线、弱网、高延迟、低带宽及频繁断开均需考虑。P0固定LAN-only业务TLS及设备认证，BLE profile禁用并测拒绝；若后续启用BLE，先完成认证加密并经F审查，不允许回退明文。模块公网授权/域名代理属P1，P0默认拒绝worker公网和热点WAN转发，不把主机浏览器/音乐联网权限给模块。</w:t>
       </w:r>
     </w:p>
     <w:p>
@@ -7604,20 +7615,19 @@
           <w:sz w:val="19"/>
           <w:szCs w:val="19"/>
         </w:rPr>
-        <w:t>bridge_id</w:t>
-      </w:r>
-      <w:r>
-        <w:rPr>
-          <w:rFonts w:ascii="Noto Sans CJK SC" w:cs="Noto Sans CJK SC" w:eastAsia="Noto Sans CJK SC" w:hAnsi="Noto Sans CJK SC"/>
-          <w:b w:val="false"/>
-          <w:bCs w:val="false"/>
-          <w:i w:val="false"/>
-          <w:iCs w:val="false"/>
-          <w:color w:val="183329"/>
-          <w:sz w:val="19"/>
-          <w:szCs w:val="19"/>
-        </w:rPr>
-        <w:t>：桥板身份/启动代次；</w:t>
+        <w:t>bridge_id：逐桥稳定设备身份；启动代次使用独立boot_id，不能重启即换身份或把两个概念混为一谈；</w:t>
+      </w:r>
+      <w:r>
+        <w:rPr>
+          <w:rFonts w:ascii="Noto Sans CJK SC" w:cs="Noto Sans CJK SC" w:eastAsia="Noto Sans CJK SC" w:hAnsi="Noto Sans CJK SC"/>
+          <w:b w:val="false"/>
+          <w:bCs w:val="false"/>
+          <w:i w:val="false"/>
+          <w:iCs w:val="false"/>
+          <w:color w:val="183329"/>
+          <w:sz w:val="19"/>
+          <w:szCs w:val="19"/>
+        </w:rPr>
       </w:r>
     </w:p>
     <w:p>
@@ -8213,7 +8223,7 @@
           <w:sz w:val="19"/>
           <w:szCs w:val="19"/>
         </w:rPr>
-        <w:t xml:space="preserve">Pi </w:t>
+        <w:t>互动确认后的目标：保留当前触点/业务分离。物理拔出释放槽位，已有认证和授权仍有效的独立无线任务继续，绑定device_id、业务session、task_id与原用户，不绑定槽位占用。桥板USB失联只使位置unknown并禁止新刷卡/绑卡/物理接入确认；已登记用户可本机PIN解锁查看、停止或撤权。控制恢复须重新认证和核对位置，匹配不重建有效业务，冲突隔离新绑定而不转移旧任务授权；业务安全失败仍关闭相应业务。T-05/11/16补槽位复用、迟到事件、恢复/冲突测试，不把当前仅更新状态视作已实现完整安全边界。</w:t>
       </w:r>
       <w:r>
         <w:rPr>
@@ -8226,20 +8236,18 @@
           <w:sz w:val="19"/>
           <w:szCs w:val="19"/>
         </w:rPr>
-        <w:t>HostEventDetector</w:t>
-      </w:r>
-      <w:r>
-        <w:rPr>
-          <w:rFonts w:ascii="Noto Sans CJK SC" w:cs="Noto Sans CJK SC" w:eastAsia="Noto Sans CJK SC" w:hAnsi="Noto Sans CJK SC"/>
-          <w:b w:val="false"/>
-          <w:bCs w:val="false"/>
-          <w:i w:val="false"/>
-          <w:iCs w:val="false"/>
-          <w:color w:val="183329"/>
-          <w:sz w:val="19"/>
-          <w:szCs w:val="19"/>
-        </w:rPr>
-        <w:t xml:space="preserve"> 和 </w:t>
+      </w:r>
+      <w:r>
+        <w:rPr>
+          <w:rFonts w:ascii="Noto Sans CJK SC" w:cs="Noto Sans CJK SC" w:eastAsia="Noto Sans CJK SC" w:hAnsi="Noto Sans CJK SC"/>
+          <w:b w:val="false"/>
+          <w:bCs w:val="false"/>
+          <w:i w:val="false"/>
+          <w:iCs w:val="false"/>
+          <w:color w:val="183329"/>
+          <w:sz w:val="19"/>
+          <w:szCs w:val="19"/>
+        </w:rPr>
       </w:r>
       <w:r>
         <w:rPr>
@@ -8252,20 +8260,18 @@
           <w:sz w:val="19"/>
           <w:szCs w:val="19"/>
         </w:rPr>
-        <w:t>ConnectionManager</w:t>
-      </w:r>
-      <w:r>
-        <w:rPr>
-          <w:rFonts w:ascii="Noto Sans CJK SC" w:cs="Noto Sans CJK SC" w:eastAsia="Noto Sans CJK SC" w:hAnsi="Noto Sans CJK SC"/>
-          <w:b w:val="false"/>
-          <w:bCs w:val="false"/>
-          <w:i w:val="false"/>
-          <w:iCs w:val="false"/>
-          <w:color w:val="183329"/>
-          <w:sz w:val="19"/>
-          <w:szCs w:val="19"/>
-        </w:rPr>
-        <w:t xml:space="preserve"> 对 bridge/slot/device/session 做一致校验；单槽 detach 只停止对应模块。</w:t>
+      </w:r>
+      <w:r>
+        <w:rPr>
+          <w:rFonts w:ascii="Noto Sans CJK SC" w:cs="Noto Sans CJK SC" w:eastAsia="Noto Sans CJK SC" w:hAnsi="Noto Sans CJK SC"/>
+          <w:b w:val="false"/>
+          <w:bCs w:val="false"/>
+          <w:i w:val="false"/>
+          <w:iCs w:val="false"/>
+          <w:color w:val="183329"/>
+          <w:sz w:val="19"/>
+          <w:szCs w:val="19"/>
+        </w:rPr>
       </w:r>
     </w:p>
     <w:p>
@@ -8289,7 +8295,7 @@
           <w:sz w:val="19"/>
           <w:szCs w:val="19"/>
         </w:rPr>
-        <w:t>故障恢复后按槽位重新认证，不以旧 token/旧实例恢复权限。</w:t>
+        <w:t>桥板恢复/模块移槽重新认证控制身份与位置绑定，不凭旧token/实例继承权限，也不无故重启仍有效的安全业务。Pi或模块自身重启导致业务会话失效时，原用户须解锁并重新认证后恢复任务。slot_id仅位置属性；控制binding_generation防旧位置事件串槽，业务按device/session/task/原用户归属。</w:t>
       </w:r>
     </w:p>
     <w:p>
@@ -8497,7 +8503,7 @@
         <w:jc w:val="left"/>
       </w:pPr>
       <w:r>
-        <w:t>产品正式名为“啸天”。最终目标是可调间距/形状的红外围界：家门口通行方向/平均速度估算，以及户外直线、折线、闭合区域的分段告警。10×10 m 仅为场景参考；首轮门口/走廊约 3–5 m 是试验距离，不是产品最大覆盖。立柱独立选配。当前仍未采购、接线、烧录或完成实测。</w:t>
+        <w:t>产品正式名“啸天”，长期目标为开放场地可调直线/折线/闭合围界及门口方向/平均速度。3–5m仅试验距离，10×10m仅后续参考。上游计划记录尚未采购/接线/烧录/实测，本轮未联系L核实当前实物进展。L按团队P0第1天下单、目标第3天到货；没有回执不得标到货或完成。</w:t>
       </w:r>
     </w:p>
     <w:p>
@@ -8699,7 +8705,7 @@
         <w:ind w:left="420" w:hanging="220"/>
       </w:pPr>
       <w:r>
-        <w:t>双模式语义已确认：围界模式每段独立报告，任一已布防边遮挡可告警；门口通行模式将两条平行检测线 A/B 作为专用测速组，只有有效时序配对才生成方向和平均速度。不能统一要求所有围界的两束同时遮挡，也不能以任意相邻折线事件差测速。</w:t>
+        <w:t>本团队14天P0只验两路独立真实遮挡/恢复、去抖/未知状态、安全传输、页面及双模块并行；不要求方向/速度或户外围界。围界每段独立、门口专用双线有效时序配对等长期语义保留在P1，不能以P0缩范围否认产品长期目标。</w:t>
       </w:r>
     </w:p>
     <w:p>
@@ -9112,7 +9118,7 @@
         <w:spacing w:after="100"/>
       </w:pPr>
       <w:r>
-        <w:t>示意 schema（非冻结字段，单调时间只在同一 boot_id 内比较）：</w:t>
+        <w:t>下列xiaotian.v2仅为P1多模式示意，非P0冻结协议。P0受控数据包络/双路字段见F审核稿p0-data-v1；单调时间只在同一device_boot_id内比较。</w:t>
       </w:r>
     </w:p>
     <w:p>
@@ -9306,7 +9312,7 @@
         <w:spacing w:after="120" w:line="269" w:lineRule="auto"/>
       </w:pPr>
       <w:r>
-        <w:t>最新 PROTOTYPE-PLAN.md：首轮两对主动红外 + 一块 ESP32，必须验证单线告警、门口双线方向/平均速度、折线分段告警；10×10 m 闭合区域后续扩展。3–5 m 仅作先期采购/试验距离，不是最终覆盖规格。测速只用同 ESP 设备边沿时间，限单人依次通行并与独立视频参考比对误差。</w:t>
+        <w:t>上游PROTOTYPE-PLAN仍建议首轮比较单线、门口方向/平均速度和折线告警；本团队最新确认的P0覆盖其执行优先级：先两路真实输入与双模块闭环，方向/速度/户外/闭合验收列P1。测速长期只用同ESP边沿时间，单人依次通行，并与独立参考比对；只算出数值不算测速验证。</w:t>
       </w:r>
     </w:p>
     <w:p>
@@ -9419,20 +9425,19 @@
           <w:sz w:val="19"/>
           <w:szCs w:val="19"/>
         </w:rPr>
-        <w:t>工程初始化</w:t>
-      </w:r>
-      <w:r>
-        <w:rPr>
-          <w:rFonts w:ascii="Noto Sans CJK SC" w:cs="Noto Sans CJK SC" w:eastAsia="Noto Sans CJK SC" w:hAnsi="Noto Sans CJK SC"/>
-          <w:b w:val="false"/>
-          <w:bCs w:val="false"/>
-          <w:i w:val="false"/>
-          <w:iCs w:val="false"/>
-          <w:color w:val="183329"/>
-          <w:sz w:val="19"/>
-          <w:szCs w:val="19"/>
-        </w:rPr>
-        <w:t xml:space="preserve">：module ID 必须经项目注册确认；原交接的 </w:t>
+        <w:t>工程初始化：module_id须D/L核查已有编号并由F批准，0x19仅旧候选，本轮未发现可作为权威的中央registry。现有ESP仓module-devkit/examples/xiaotian/仅两份需求/执行文档，Pi仓无该目录；目标在既有ESP示例下新增firmware/，Pi由Z做受控页面，不声称已有固件/插件。GPIO/板型/输出电平由L实测后定。</w:t>
+      </w:r>
+      <w:r>
+        <w:rPr>
+          <w:rFonts w:ascii="Noto Sans CJK SC" w:cs="Noto Sans CJK SC" w:eastAsia="Noto Sans CJK SC" w:hAnsi="Noto Sans CJK SC"/>
+          <w:b w:val="false"/>
+          <w:bCs w:val="false"/>
+          <w:i w:val="false"/>
+          <w:iCs w:val="false"/>
+          <w:color w:val="183329"/>
+          <w:sz w:val="19"/>
+          <w:szCs w:val="19"/>
+        </w:rPr>
       </w:r>
       <w:r>
         <w:rPr>
@@ -9445,20 +9450,18 @@
           <w:sz w:val="19"/>
           <w:szCs w:val="19"/>
         </w:rPr>
-        <w:t>0x19</w:t>
-      </w:r>
-      <w:r>
-        <w:rPr>
-          <w:rFonts w:ascii="Noto Sans CJK SC" w:cs="Noto Sans CJK SC" w:eastAsia="Noto Sans CJK SC" w:hAnsi="Noto Sans CJK SC"/>
-          <w:b w:val="false"/>
-          <w:bCs w:val="false"/>
-          <w:i w:val="false"/>
-          <w:iCs w:val="false"/>
-          <w:color w:val="183329"/>
-          <w:sz w:val="19"/>
-          <w:szCs w:val="19"/>
-        </w:rPr>
-        <w:t xml:space="preserve"> 只是候选，不得未经确认写 manifest/固件。模块实例名不可把 MAC 当秘密；使用 SDK 分配的设备 identity/instance 规则。</w:t>
+      </w:r>
+      <w:r>
+        <w:rPr>
+          <w:rFonts w:ascii="Noto Sans CJK SC" w:cs="Noto Sans CJK SC" w:eastAsia="Noto Sans CJK SC" w:hAnsi="Noto Sans CJK SC"/>
+          <w:b w:val="false"/>
+          <w:bCs w:val="false"/>
+          <w:i w:val="false"/>
+          <w:iCs w:val="false"/>
+          <w:color w:val="183329"/>
+          <w:sz w:val="19"/>
+          <w:szCs w:val="19"/>
+        </w:rPr>
       </w:r>
     </w:p>
     <w:p>
@@ -9472,7 +9475,7 @@
         <w:ind w:left="420" w:hanging="220"/>
       </w:pPr>
       <w:r>
-        <w:t>首轮先实现三种可重布置模式、同 ESP 设备侧时间、段 ID/布局和无效通行判定；module_id 经 registry 确认。Pi 页面采用受控 UI schema 与隔离 worker，不加载任意 QML。</w:t>
+        <w:t>P0先实现同ESP两路独立事件与时间、状态未知和安全会话；Pi页面采用受控UI与隔离worker，不加载模块任意QML。既有C ABI/盆栽JSON历史路径须迁移，不能原样复用后宣称隔离。模式/测速/户外扩展按P1独立验收。</w:t>
       </w:r>
     </w:p>
     <w:p>
@@ -11234,7 +11237,7 @@
           <w:sz w:val="20"/>
           <w:szCs w:val="20"/>
         </w:rPr>
-        <w:t>模块无线 OTA 暂缓。ESP-IDF OTA 需要双 app slot 与 otadata、签名/安全启动策略、试运行自检和回滚；当前正式分区只有 factory，硬件 Flash 余量未知。若未来从 Pi 中继固件，仍须端到端包签名和版本校验，Pi 不应能伪造供应商固件。</w:t>
+        <w:t>ESP模块无线OTA暂缓。当前正式partitions.csv仅factory app（0x10000，大小0x177000），无ota_0/ota_1或otadata；安全回滚OTA需重新评估分区/签名/自检和恢复。盆栽历史记录16MB Flash只对应其记录板，不代表每块目标设备容量；应逐板核实，不能笼统宣称已有双槽。</w:t>
       </w:r>
     </w:p>
     <w:p>
@@ -11402,7 +11405,7 @@
           </w:tcPr>
           <w:p>
             <w:r>
-              <w:t>P0 仓库治理/威胁模型</w:t>
+              <w:t>P0 第1～3天：设计与预检</w:t>
             </w:r>
           </w:p>
         </w:tc>
@@ -11420,7 +11423,7 @@
           </w:tcPr>
           <w:p>
             <w:r>
-              <w:t>SDK 单一权威源；定义数据流、身份、信任根、攻击面和兼容矩阵</w:t>
+              <w:t>F范围/接口/权限；D身份/协议/SDK来源；Z Qt/SQLCipher/worker；L采购/双槽电气</w:t>
             </w:r>
           </w:p>
         </w:tc>
@@ -11438,7 +11441,7 @@
           </w:tcPr>
           <w:p>
             <w:r>
-              <w:t>两仓库可独立构建/校验 SDK；安全协议草案经审阅</w:t>
+              <w:t>D/Z/L签认；密码设计审查；来源/哈希与构建路线；B-07固件发布风险处置；FAIL有owner和修复日。</w:t>
             </w:r>
           </w:p>
         </w:tc>
@@ -11461,7 +11464,7 @@
           </w:tcPr>
           <w:p>
             <w:r>
-              <w:t>P1 本机用户基础</w:t>
+              <w:t>P0 第4～10天：最小安全闭环</w:t>
             </w:r>
           </w:p>
         </w:tc>
@@ -11479,7 +11482,7 @@
           </w:tcPr>
           <w:p>
             <w:r>
-              <w:t>NFC/PIN、用户服务、锁屏、任务归属、SQLCipher、恢复/备份</w:t>
+              <w:t>RC522/PIN/任务归属、SQLCipher、worker/受控UI、PBR AEAD/ACK、LAN TLS、两模块真实数据</w:t>
             </w:r>
           </w:p>
         </w:tc>
@@ -11497,7 +11500,7 @@
           </w:tcPr>
           <w:p>
             <w:r>
-              <w:t>跨用户读写测试拒绝；恢复/销毁路径明确；关机事务保护</w:t>
+              <w:t>跨用户/锁屏任务/拒网/篡改/重放/明文拒绝通过；盆栽全字段和啸天两路分别实测。</w:t>
             </w:r>
           </w:p>
         </w:tc>
@@ -11520,7 +11523,7 @@
           </w:tcPr>
           <w:p>
             <w:r>
-              <w:t>P2 模块边界</w:t>
+              <w:t>P0 第11～14天：并发与最终验收</w:t>
             </w:r>
           </w:p>
         </w:tc>
@@ -11538,7 +11541,7 @@
           </w:tcPr>
           <w:p>
             <w:r>
-              <w:t>新身份认证、TLS/BLE 安全、旧协议拒绝、模块 worker、受控 UI、网络代理</w:t>
+              <w:t>两模块分别运行后，同时至少30分钟；单槽故障、桥重启/重认证，F审核PR与完整旅程</w:t>
             </w:r>
           </w:p>
         </w:tc>
@@ -11556,7 +11559,7 @@
           </w:tcPr>
           <w:p>
             <w:r>
-              <w:t>模块无法绕过权限读库/直连外网；崩溃隔离和撤权断连测试通过</w:t>
+              <w:t>T-16/Journey-001实机证据全部符合；安全硬门槛不可削减，任一失败则P0未通过。</w:t>
             </w:r>
           </w:p>
         </w:tc>
@@ -11579,7 +11582,7 @@
           </w:tcPr>
           <w:p>
             <w:r>
-              <w:t>P3 双槽与电源</w:t>
+              <w:t>P1 安全产品化</w:t>
             </w:r>
           </w:p>
         </w:tc>
@@ -11597,7 +11600,7 @@
           </w:tcPr>
           <w:p>
             <w:r>
-              <w:t>硬件拓扑选择、每槽状态机、遥测服务、OS+终端显示</w:t>
+              <w:t>完整备份/恢复码/删除、生产身份/密钥、完整sandbox/代理、正式密码学卡</w:t>
             </w:r>
           </w:p>
         </w:tc>
@@ -11615,7 +11618,7 @@
           </w:tcPr>
           <w:p>
             <w:r>
-              <w:t>双模块并行/交错热插拔与失联策略实机验证</w:t>
+              <w:t>恢复/权限/凭据生命周期及加固拒绝测试独立通过，不冒称P0已具备恢复。</w:t>
             </w:r>
           </w:p>
         </w:tc>
@@ -11638,7 +11641,7 @@
           </w:tcPr>
           <w:p>
             <w:r>
-              <w:t>P4 场景模块</w:t>
+              <w:t>P1 硬件与场景深化</w:t>
             </w:r>
           </w:p>
         </w:tc>
@@ -11656,7 +11659,7 @@
           </w:tcPr>
           <w:p>
             <w:r>
-              <w:t>一款血压计适配、啸天红外桌面原型</w:t>
+              <w:t>双槽长期可靠性、啸天方向/速度/户外、单型号血压计、整机电量</w:t>
             </w:r>
           </w:p>
         </w:tc>
@@ -11674,7 +11677,7 @@
           </w:tcPr>
           <w:p>
             <w:r>
-              <w:t>测量/告警任务绑定用户；协议错误/断线/弱网展示正确</w:t>
+              <w:t>器件/环境/误报漏报/测速和电量接口均有实测，未测保持未知。</w:t>
             </w:r>
           </w:p>
         </w:tc>
@@ -11697,7 +11700,7 @@
           </w:tcPr>
           <w:p>
             <w:r>
-              <w:t>P5 户外与适老</w:t>
+              <w:t>P2 长期交付</w:t>
             </w:r>
           </w:p>
         </w:tc>
@@ -11715,7 +11718,7 @@
           </w:tcPr>
           <w:p>
             <w:r>
-              <w:t>红外户外部署、电池续航、触摸/语音/可访问性回归</w:t>
+              <w:t>SDK完整发布自动化、进一步适老化、生产维修/版本治理</w:t>
             </w:r>
           </w:p>
         </w:tc>
@@ -11733,7 +11736,7 @@
           </w:tcPr>
           <w:p>
             <w:r>
-              <w:t>有距离、环境、误报/漏报和续航实测记录；未测项明确标注</w:t>
+              <w:t>发布/来源校验和兼容性可重复；不能延后P0最小来源检查。</w:t>
             </w:r>
           </w:p>
         </w:tc>
@@ -11883,7 +11886,7 @@
           <w:sz w:val="19"/>
           <w:szCs w:val="19"/>
         </w:rPr>
-        <w:t>安全测试覆盖错误身份、重放、旧协议降级、证书失效、跨用户访问、撤权即时断网、损坏数据库、恢复凭证丢失和备份泄露。</w:t>
+        <w:t>安全测试按阶段覆盖错误身份、重放、明文降级、证书失效、跨用户、撤权断网与损坏DB；恢复凭证丢失/备份泄露为P1完整恢复路径测试，不以P0未实现的恢复能力冒称通过。当前跟踪私有固件的B-07先于相关产物发布处置。</w:t>
       </w:r>
     </w:p>
     <w:p>
@@ -12169,7 +12172,7 @@
           </w:tcPr>
           <w:p>
             <w:r>
-              <w:t>Pi 3B + Bookworm 桌面默认配置已确认；现场桌面会话类型（Wayland/X11）及面板插件接口待核验。</w:t>
+              <w:t>用户指定Pi 3B、ARM64 Bookworm、Qt6.5.3、Wayland；本轮未核验运行态，历史为Qt6.4.2/labwc。</w:t>
             </w:r>
           </w:p>
         </w:tc>
@@ -12187,7 +12190,7 @@
           </w:tcPr>
           <w:p>
             <w:r>
-              <w:t>以实际会话核验托盘/电量集成；Pi 3B 资源约束需实测。</w:t>
+              <w:t>确认实际Qt/plugin/桌面面板和UPower；目标与历史版本分别记录。</w:t>
             </w:r>
           </w:p>
         </w:tc>
@@ -12287,7 +12290,7 @@
           </w:tcPr>
           <w:p>
             <w:r>
-              <w:t>SDK 权威源放在哪个仓库？同步脚本改为发布制品/子模块/独立 SDK 仓库中的哪一种？</w:t>
+              <w:t>两仓SDK长期发布权威/制品方式尚未选定；P0最小来源/哈希与同步检查当前失败。</w:t>
             </w:r>
           </w:p>
         </w:tc>
@@ -12305,7 +12308,7 @@
           </w:tcPr>
           <w:p>
             <w:r>
-              <w:t>用户决定暂不选型；P0 前比较主项目版本发布与独立 SDK 仓库，不提前拆分。</w:t>
+              <w:t>D/Z在T-02先做显式跨仓来源和校验，完整发布工具P2再定；不自动覆盖SDK。</w:t>
             </w:r>
           </w:p>
         </w:tc>
@@ -13014,7 +13017,7 @@
           <w:sz w:val="19"/>
           <w:szCs w:val="19"/>
         </w:rPr>
-        <w:t xml:space="preserve">先做本机身份/数据服务与模块进程隔离的设计验证；不应先把健康数据接入现有 </w:t>
+        <w:t>本轮F授权确认通过的是已订正报告、分工、P0范围与安全边界；当前无Pi用户/PIN/SQLCipher/worker及新安全协议实现的验收证据，不应先让真实敏感数据进入现有QLibrary插件。</w:t>
       </w:r>
       <w:r>
         <w:rPr>
@@ -13027,20 +13030,18 @@
           <w:sz w:val="19"/>
           <w:szCs w:val="19"/>
         </w:rPr>
-        <w:t>QLibrary</w:t>
-      </w:r>
-      <w:r>
-        <w:rPr>
-          <w:rFonts w:ascii="Noto Sans CJK SC" w:cs="Noto Sans CJK SC" w:eastAsia="Noto Sans CJK SC" w:hAnsi="Noto Sans CJK SC"/>
-          <w:b w:val="false"/>
-          <w:bCs w:val="false"/>
-          <w:i w:val="false"/>
-          <w:iCs w:val="false"/>
-          <w:color w:val="183329"/>
-          <w:sz w:val="19"/>
-          <w:szCs w:val="19"/>
-        </w:rPr>
-        <w:t xml:space="preserve"> 主进程插件。</w:t>
+      </w:r>
+      <w:r>
+        <w:rPr>
+          <w:rFonts w:ascii="Noto Sans CJK SC" w:cs="Noto Sans CJK SC" w:eastAsia="Noto Sans CJK SC" w:hAnsi="Noto Sans CJK SC"/>
+          <w:b w:val="false"/>
+          <w:bCs w:val="false"/>
+          <w:i w:val="false"/>
+          <w:iCs w:val="false"/>
+          <w:color w:val="183329"/>
+          <w:sz w:val="19"/>
+          <w:szCs w:val="19"/>
+        </w:rPr>
       </w:r>
     </w:p>
     <w:p>
@@ -13064,7 +13065,7 @@
           <w:sz w:val="19"/>
           <w:szCs w:val="19"/>
         </w:rPr>
-        <w:t>先完成 SDK 权威源、新安全协议和旧协议拒绝策略，再做桥板双槽并行。</w:t>
+        <w:t>D/Z第1天开展安全/驱动/隔离预检，第2天前明确跨仓SDK来源/哈希和修复路线；L并行采购及双槽电气核验。不得把完整SDK发布工具后移P2当作跳过P0一致性核对的理由。</w:t>
       </w:r>
     </w:p>
     <w:p>
@@ -13078,7 +13079,7 @@
         <w:ind w:left="420" w:hanging="220"/>
       </w:pPr>
       <w:r>
-        <w:t>啸天最终方向是开放场地可配置红外围界；首轮按两对探头/一 ESP，验证单线、平行双线方向/平均速度和折线段。10×10 m 闭合区需按周界边数扩展，尚未采购/实测。</w:t>
+        <w:t>啸天最终目标仍为可调红外围界与门口方向/速度；本P0仅要求两路真实输入、安全页面和双模块并行。10×10m闭合区、测速/户外属后续；采购/接线状态需L回执，本轮不代签。</w:t>
       </w:r>
     </w:p>
     <w:p>
@@ -13164,7 +13165,7 @@
         <w:ind w:left="420" w:hanging="220"/>
       </w:pPr>
       <w:r>
-        <w:t>以上为规划建议，不是实现或实测状态。已确认项已经写入正文；第 17 节只保留尚待器件、环境或拓扑确认的工程决策。</w:t>
+        <w:t>本报告v4.1是按源码/历史记录核对后的规划与F文档审定，不是实现或实机结论；D/Z/L技术确认、密码协议细节和B-01～B-07证据仍待完成，T-01/IT-001及T-17/P0均未通过。确认范围与未检查项见docs/devdocs/04-dev-tasks-f-review.md。</w:t>
       </w:r>
     </w:p>
     <w:p>
@@ -13915,7 +13916,35 @@
     <w:p>
       <w:pPr/>
       <w:r>
-        <w:t xml:space="preserve">审查结论：初始需求主题与后续用户决策均已映射。最新桥板固件有上游记录的 RC522 UID/PBR1 单次实测，但 Pi 接收/绑卡登录、桥板逐板 AEAD、新安全 PBR 和桥板 MAX17043 读取仍未完成或验收。啸天已按最新多模式开放围界目标更新；当前仍处设计准备阶段。建议不代表已实现功能或实机结论。</w:t>
+        <w:t>覆盖复核：初始主题与后续P0扩展已映射，旧分期/SDK一致性/锁屏偏差已订正。当前RC522/PBR仅有上游历史实测记录；本轮通过的是主机CRC/RC522子集与盆栽历史ABI逻辑，不是AEAD、Qt6.5.3目标驱动、双槽或实机验收。私有固件及嵌入产物已被Git跟踪，B-07未关闭，不得以gitignore或未见PEM作安全背书。</w:t>
+      </w:r>
+    </w:p>
+    <w:p>
+      <w:pPr>
+        <w:pStyle w:val="Heading1"/>
+      </w:pPr>
+      <w:r>
+        <w:t>附录 B｜F 授权审定与执行门禁</w:t>
+      </w:r>
+    </w:p>
+    <w:p>
+      <w:r>
+        <w:t>用户于2026-10-26明确授权“修改我的审核稿，然后替我确认”。代理代表Mr.F确认本轮事实订正、四人职责、14天P0范围、权限/任务归属/密钥边界与分阶段冻结规则；允许按既定边界开展可行性预检和实现设计。此为文档审定，不是未提交密码方案的提前安全认可。</w:t>
+      </w:r>
+    </w:p>
+    <w:p>
+      <w:r>
+        <w:t>D/Z/L技术签认、B-01～B-07证据和发布风险处置尚未完成；T-01/IT-001及T-17/P0未通过。F不会代签采购到货、真实设备状态、电气测试或未执行结果。最高优先级先处理已跟踪私有固件，再收口SDK来源和安全协议/驱动/隔离可行性。</w:t>
+      </w:r>
+    </w:p>
+    <w:p>
+      <w:r>
+        <w:t>未检查：第三方逐行审计、完整应用编译/全套GUI媒体、真实凭据有效性、在线Pi/ESP、双槽电气/探头实物及DOCX最终分页渲染。无部署、烧录、凭据轮换或Git历史清理。详见docs/devdocs/04-dev-tasks-f-review.md；工作分支docs/f-day1-interface-freeze，记录尚未提交。</w:t>
+      </w:r>
+    </w:p>
+    <w:p>
+      <w:r>
+        <w:t>互动澄清确认（2026-10-26）：用户逐项选择并最终确认7项决策：离槽继续有效无线任务；桥板失联继续已有任务；授权只读产物核查；关键预检失败保P0范围并重新排期；任务按设备/原用户而非占槽绑定；允许本机PIN解锁；控制恢复核对绑定且保留有效业务。第3天关键预检或第7天闭环失败时由F记录负责人/新截止日，第14天可作标注的阶段演示但P0未通过。本文与F审核稿据此修订，不代表实现或实机验收。</w:t>
       </w:r>
     </w:p>
     <w:sectPr>

</xml_diff>